<commit_message>
ajsutes nomina y manejo de comisiones de productos
</commit_message>
<xml_diff>
--- a/PENDIENTES KYROS STYLOS.docx
+++ b/PENDIENTES KYROS STYLOS.docx
@@ -5,6 +5,34 @@
     <w:p/>
     <w:p>
       <w:r>
+        <w:t>VALIDACION DE NO PERMITIR EN PRODUCTO, AGREGARLO A UNA FACTURA QUE YA ESTE PAGADA, Y NO AUTOCOMPLETAR</w:t>
+      </w:r>
+      <w:r>
+        <w:t xml:space="preserve"> yo mismo debo poner manualmente el valor, porque pasa que en la factura inicialmente eran 100 mil, luego agregue un producto de 5 mil, y en la factura aun debe estar 100 </w:t>
+      </w:r>
+      <w:proofErr w:type="gramStart"/>
+      <w:r>
+        <w:t>mil yo mismo</w:t>
+      </w:r>
+      <w:proofErr w:type="gramEnd"/>
+      <w:r>
+        <w:t xml:space="preserve"> debo </w:t>
+      </w:r>
+      <w:proofErr w:type="gramStart"/>
+      <w:r>
+        <w:t xml:space="preserve">poner </w:t>
+      </w:r>
+      <w:r>
+        <w:t xml:space="preserve"> a</w:t>
+      </w:r>
+      <w:proofErr w:type="gramEnd"/>
+      <w:r>
+        <w:t xml:space="preserve"> donde le voy a sumar el valor a pagar porque yo no se si la persona me va a pagar ese restante por otro método de pago </w:t>
+      </w:r>
+    </w:p>
+    <w:p/>
+    <w:p>
+      <w:r>
         <w:t>RENOMBRAR EL ROL CAJERO POR ADMINSITRADORES DE PUNTO</w:t>
       </w:r>
     </w:p>
@@ -153,11 +181,7 @@
         <w:t>CORREGI</w:t>
       </w:r>
       <w:r>
-        <w:t xml:space="preserve">R VALES, RENOMBRALO A SERVICIO DE TRABAJADORES  , Y DIFERENCIARLO DE VALES QUE NO SERA UN METODO DE PAGO SI NO QUE UN SISTEMA PARA ADMINISTRAR PRESTAMOS DE LIBRE INVERSION A MIS TRABJADORES , YA SEA A CAJERO O TECNICOS, , ENTONCES RECORDEMOS SERVICIO DE TRABAJADORES SERA METODO DE PAGO , VALES SERA PRESTAMOS A LOS TRABAJADORES , INDIANDO CANTIDAD DE CUOTAS, VALOR Y A QUIEN SE LE PRESTAM Y QUE FECHA Y CUANDO EL INICIO DE COBRO, EL SISTEMA DEBE SABER MANEJAR AL GENERAR LA </w:t>
-      </w:r>
-      <w:r>
-        <w:lastRenderedPageBreak/>
-        <w:t>NOMINA ESTOS DESCUENTOS, YA SEA EN LIIQUIDACION DE TRABAJADOR INDEPENDIENTE O NOMINA SEMANAL</w:t>
+        <w:t>R VALES, RENOMBRALO A SERVICIO DE TRABAJADORES  , Y DIFERENCIARLO DE VALES QUE NO SERA UN METODO DE PAGO SI NO QUE UN SISTEMA PARA ADMINISTRAR PRESTAMOS DE LIBRE INVERSION A MIS TRABJADORES , YA SEA A CAJERO O TECNICOS, , ENTONCES RECORDEMOS SERVICIO DE TRABAJADORES SERA METODO DE PAGO , VALES SERA PRESTAMOS A LOS TRABAJADORES , INDIANDO CANTIDAD DE CUOTAS, VALOR Y A QUIEN SE LE PRESTAM Y QUE FECHA Y CUANDO EL INICIO DE COBRO, EL SISTEMA DEBE SABER MANEJAR AL GENERAR LA NOMINA ESTOS DESCUENTOS, YA SEA EN LIIQUIDACION DE TRABAJADOR INDEPENDIENTE O NOMINA SEMANAL</w:t>
       </w:r>
     </w:p>
     <w:p/>
@@ -482,6 +506,7 @@
           <w:b/>
           <w:bCs/>
         </w:rPr>
+        <w:lastRenderedPageBreak/>
         <w:t>Vista de Cliente: Agregar columna "Servicios" con el total acumulado. Al hacer clic, abrir un modal con la tabla de facturas y el detalle de cada servicio (icono de ojo).</w:t>
       </w:r>
     </w:p>
@@ -535,7 +560,6 @@
           <w:b/>
           <w:bCs/>
         </w:rPr>
-        <w:lastRenderedPageBreak/>
         <w:t xml:space="preserve">Diferenciación: * Servicio de Trabajador: Es el método de pago </w:t>
       </w:r>
       <w:r>
@@ -3080,6 +3104,7 @@
   <w:style w:type="character" w:default="1" w:styleId="Fuentedeprrafopredeter">
     <w:name w:val="Default Paragraph Font"/>
     <w:uiPriority w:val="1"/>
+    <w:semiHidden/>
     <w:unhideWhenUsed/>
   </w:style>
   <w:style w:type="table" w:default="1" w:styleId="Tablanormal">

</xml_diff>